<commit_message>
Further updates to templates
</commit_message>
<xml_diff>
--- a/src/templates/cover_letter_2.docx
+++ b/src/templates/cover_letter_2.docx
@@ -43,7 +43,7 @@
             <v:path o:extrusionok="f" gradientshapeok="t" o:connecttype="rect"/>
             <o:lock v:ext="edit" aspectratio="t"/>
           </v:shapetype>
-          <v:shape id="_x0000_i1025" type="#_x0000_t75" style="width:211.3pt;height:61.7pt">
+          <v:shape id="_x0000_i1025" type="#_x0000_t75" style="width:211.1pt;height:61.65pt">
             <v:imagedata r:id="rId8" o:title=""/>
           </v:shape>
         </w:pict>
@@ -575,7 +575,21 @@
           <w:rFonts w:ascii="Arial" w:hAnsi="Arial" w:cs="Arial"/>
           <w:sz w:val="20"/>
         </w:rPr>
-        <w:t xml:space="preserve">.  At your request, we have prepared a proposal for a system that we recommend as a best suited balance between your energy production goals, financial considerations and existing physical constraints.  </w:t>
+        <w:t>.  At your request, we have prepared a proposal for a system that we recommend as a best suited balance between your energy production goals, financial considerations</w:t>
+      </w:r>
+      <w:r>
+        <w:rPr>
+          <w:rFonts w:ascii="Arial" w:hAnsi="Arial" w:cs="Arial"/>
+          <w:sz w:val="20"/>
+        </w:rPr>
+        <w:t>,</w:t>
+      </w:r>
+      <w:r>
+        <w:rPr>
+          <w:rFonts w:ascii="Arial" w:hAnsi="Arial" w:cs="Arial"/>
+          <w:sz w:val="20"/>
+        </w:rPr>
+        <w:t xml:space="preserve"> and existing physical constraints.  </w:t>
       </w:r>
       <w:r>
         <w:rPr>
@@ -752,7 +766,23 @@
           <w:rFonts w:ascii="Arial" w:hAnsi="Arial" w:cs="Arial"/>
           <w:sz w:val="20"/>
         </w:rPr>
-        <w:t>Other system sizes and configurations are available, however, the proposed system was designed to maximize Return on Investment (ROI) and payba</w:t>
+        <w:t xml:space="preserve">Other system sizes and configurations are </w:t>
+      </w:r>
+      <w:proofErr w:type="gramStart"/>
+      <w:r>
+        <w:rPr>
+          <w:rFonts w:ascii="Arial" w:hAnsi="Arial" w:cs="Arial"/>
+          <w:sz w:val="20"/>
+        </w:rPr>
+        <w:t>available,</w:t>
+      </w:r>
+      <w:proofErr w:type="gramEnd"/>
+      <w:r>
+        <w:rPr>
+          <w:rFonts w:ascii="Arial" w:hAnsi="Arial" w:cs="Arial"/>
+          <w:sz w:val="20"/>
+        </w:rPr>
+        <w:t xml:space="preserve"> however, the proposed system was designed to maximize Return on Investment (ROI) and payba</w:t>
       </w:r>
       <w:r>
         <w:rPr>
@@ -1210,32 +1240,10 @@
         <w:rPr>
           <w:rFonts w:ascii="Arial" w:hAnsi="Arial" w:cs="Arial"/>
           <w:i/>
-          <w:sz w:val="20"/>
-        </w:rPr>
-        <w:t xml:space="preserve">PLEASE NOTE:  Tree trimming </w:t>
-      </w:r>
-      <w:r>
-        <w:rPr>
-          <w:rFonts w:ascii="Arial" w:hAnsi="Arial" w:cs="Arial"/>
-          <w:i/>
-          <w:sz w:val="20"/>
-        </w:rPr>
-        <w:t xml:space="preserve">may </w:t>
-      </w:r>
-      <w:r>
-        <w:rPr>
-          <w:rFonts w:ascii="Arial" w:hAnsi="Arial" w:cs="Arial"/>
-          <w:i/>
-          <w:sz w:val="20"/>
-        </w:rPr>
-        <w:t>be required for the proposed system to produce the projected kWh outputs.</w:t>
-      </w:r>
-      <w:r>
-        <w:rPr>
-          <w:rFonts w:ascii="Arial" w:hAnsi="Arial" w:cs="Arial"/>
-          <w:sz w:val="20"/>
-        </w:rPr>
-        <w:t xml:space="preserve">  </w:t>
+          <w:iCs/>
+          <w:sz w:val="20"/>
+        </w:rPr>
+        <w:t>{{TREE_TRIMMING_REQUIRED}}</w:t>
       </w:r>
       <w:r>
         <w:rPr>
@@ -1335,7 +1343,15 @@
           <w:rFonts w:ascii="Arial" w:hAnsi="Arial" w:cs="Arial"/>
           <w:sz w:val="20"/>
         </w:rPr>
-        <w:t>{{PANEL_S</w:t>
+        <w:t>{{PANEL_</w:t>
+      </w:r>
+      <w:proofErr w:type="gramStart"/>
+      <w:r>
+        <w:rPr>
+          <w:rFonts w:ascii="Arial" w:hAnsi="Arial" w:cs="Arial"/>
+          <w:sz w:val="20"/>
+        </w:rPr>
+        <w:t>S</w:t>
       </w:r>
       <w:r>
         <w:rPr>
@@ -1356,7 +1372,15 @@
           <w:rFonts w:ascii="Arial" w:hAnsi="Arial" w:cs="Arial"/>
           <w:sz w:val="20"/>
         </w:rPr>
-        <w:t>-watt</w:t>
+        <w:t>-</w:t>
+      </w:r>
+      <w:proofErr w:type="gramEnd"/>
+      <w:r>
+        <w:rPr>
+          <w:rFonts w:ascii="Arial" w:hAnsi="Arial" w:cs="Arial"/>
+          <w:sz w:val="20"/>
+        </w:rPr>
+        <w:t>watt</w:t>
       </w:r>
       <w:r>
         <w:rPr>
@@ -1391,14 +1415,30 @@
           <w:rFonts w:ascii="Arial" w:hAnsi="Arial" w:cs="Arial"/>
           <w:sz w:val="20"/>
         </w:rPr>
-        <w:t>{{PANEL_MANUFACTURER}}</w:t>
-      </w:r>
-      <w:r>
-        <w:rPr>
-          <w:rFonts w:ascii="Arial" w:hAnsi="Arial" w:cs="Arial"/>
-          <w:sz w:val="20"/>
-        </w:rPr>
-        <w:t xml:space="preserve">.  The </w:t>
+        <w:t>{{PANEL_</w:t>
+      </w:r>
+      <w:proofErr w:type="gramStart"/>
+      <w:r>
+        <w:rPr>
+          <w:rFonts w:ascii="Arial" w:hAnsi="Arial" w:cs="Arial"/>
+          <w:sz w:val="20"/>
+        </w:rPr>
+        <w:t>MANUFACTURER}}</w:t>
+      </w:r>
+      <w:r>
+        <w:rPr>
+          <w:rFonts w:ascii="Arial" w:hAnsi="Arial" w:cs="Arial"/>
+          <w:sz w:val="20"/>
+        </w:rPr>
+        <w:t>.</w:t>
+      </w:r>
+      <w:proofErr w:type="gramEnd"/>
+      <w:r>
+        <w:rPr>
+          <w:rFonts w:ascii="Arial" w:hAnsi="Arial" w:cs="Arial"/>
+          <w:sz w:val="20"/>
+        </w:rPr>
+        <w:t xml:space="preserve">  The </w:t>
       </w:r>
       <w:r>
         <w:rPr>
@@ -1454,7 +1494,15 @@
           <w:rFonts w:ascii="Arial" w:hAnsi="Arial" w:cs="Arial"/>
           <w:sz w:val="20"/>
         </w:rPr>
-        <w:t>{{PANEL_PTC_RATIO}}</w:t>
+        <w:t>{{PANEL_PTC_</w:t>
+      </w:r>
+      <w:proofErr w:type="gramStart"/>
+      <w:r>
+        <w:rPr>
+          <w:rFonts w:ascii="Arial" w:hAnsi="Arial" w:cs="Arial"/>
+          <w:sz w:val="20"/>
+        </w:rPr>
+        <w:t>RATIO}}</w:t>
       </w:r>
       <w:r>
         <w:rPr>
@@ -1463,6 +1511,7 @@
         </w:rPr>
         <w:t>%</w:t>
       </w:r>
+      <w:proofErr w:type="gramEnd"/>
       <w:r>
         <w:rPr>
           <w:rFonts w:ascii="Arial" w:hAnsi="Arial" w:cs="Arial"/>
@@ -1510,14 +1559,30 @@
           <w:rFonts w:ascii="Arial" w:hAnsi="Arial" w:cs="Arial"/>
           <w:sz w:val="20"/>
         </w:rPr>
-        <w:t>{{INVERTER_WARRANTY}}</w:t>
-      </w:r>
-      <w:r>
-        <w:rPr>
-          <w:rFonts w:ascii="Arial" w:hAnsi="Arial" w:cs="Arial"/>
-          <w:sz w:val="20"/>
-        </w:rPr>
-        <w:t>-year warranties.</w:t>
+        <w:t>{{INVERTER_</w:t>
+      </w:r>
+      <w:proofErr w:type="gramStart"/>
+      <w:r>
+        <w:rPr>
+          <w:rFonts w:ascii="Arial" w:hAnsi="Arial" w:cs="Arial"/>
+          <w:sz w:val="20"/>
+        </w:rPr>
+        <w:t>WARRANTY}}</w:t>
+      </w:r>
+      <w:r>
+        <w:rPr>
+          <w:rFonts w:ascii="Arial" w:hAnsi="Arial" w:cs="Arial"/>
+          <w:sz w:val="20"/>
+        </w:rPr>
+        <w:t>-</w:t>
+      </w:r>
+      <w:proofErr w:type="gramEnd"/>
+      <w:r>
+        <w:rPr>
+          <w:rFonts w:ascii="Arial" w:hAnsi="Arial" w:cs="Arial"/>
+          <w:sz w:val="20"/>
+        </w:rPr>
+        <w:t>year warranties.</w:t>
       </w:r>
       <w:r>
         <w:rPr>
@@ -1735,6 +1800,13 @@
           <w:sz w:val="20"/>
         </w:rPr>
       </w:pPr>
+      <w:r>
+        <w:rPr>
+          <w:rFonts w:ascii="Arial" w:hAnsi="Arial" w:cs="Arial"/>
+          <w:sz w:val="20"/>
+        </w:rPr>
+        <w:br w:type="page"/>
+      </w:r>
       <w:r>
         <w:rPr>
           <w:rFonts w:ascii="Arial" w:hAnsi="Arial" w:cs="Arial"/>
@@ -1744,6 +1816,7 @@
           <w:szCs w:val="19"/>
           <w:u w:val="single"/>
         </w:rPr>
+        <w:lastRenderedPageBreak/>
         <w:pict w14:anchorId="7D894A86">
           <v:shape id="_x0000_s2204" type="#_x0000_t75" style="position:absolute;left:0;text-align:left;margin-left:366.6pt;margin-top:-8.9pt;width:2in;height:41.25pt;z-index:1">
             <v:imagedata r:id="rId8" o:title=""/>
@@ -2384,6 +2457,7 @@
         <w:ind w:left="-180"/>
         <w:rPr>
           <w:rFonts w:ascii="Arial" w:hAnsi="Arial" w:cs="Arial"/>
+          <w:color w:val="000000"/>
           <w:sz w:val="18"/>
           <w:szCs w:val="18"/>
         </w:rPr>
@@ -2395,49 +2469,56 @@
           <w:szCs w:val="18"/>
         </w:rPr>
         <w:tab/>
-        <w:t>Building permit &amp; Utility application</w:t>
-      </w:r>
-      <w:r>
-        <w:rPr>
-          <w:rFonts w:ascii="Arial" w:hAnsi="Arial" w:cs="Arial"/>
-          <w:color w:val="FF0000"/>
-          <w:sz w:val="18"/>
-          <w:szCs w:val="18"/>
-        </w:rPr>
-        <w:t xml:space="preserve"> </w:t>
-      </w:r>
-      <w:r>
-        <w:rPr>
-          <w:rFonts w:ascii="Arial" w:hAnsi="Arial" w:cs="Arial"/>
-          <w:sz w:val="18"/>
-          <w:szCs w:val="18"/>
-        </w:rPr>
-        <w:t>(</w:t>
-      </w:r>
-      <w:r>
-        <w:rPr>
-          <w:rFonts w:ascii="Arial" w:hAnsi="Arial" w:cs="Arial"/>
-          <w:sz w:val="18"/>
-          <w:szCs w:val="18"/>
-        </w:rPr>
-        <w:t>MID NEM2</w:t>
-      </w:r>
-      <w:r>
-        <w:rPr>
-          <w:rFonts w:ascii="Arial" w:hAnsi="Arial" w:cs="Arial"/>
-          <w:sz w:val="18"/>
-          <w:szCs w:val="18"/>
-        </w:rPr>
-        <w:t xml:space="preserve"> w/ </w:t>
-      </w:r>
-      <w:r>
-        <w:rPr>
-          <w:rFonts w:ascii="Arial" w:hAnsi="Arial" w:cs="Arial"/>
-          <w:sz w:val="18"/>
-          <w:szCs w:val="18"/>
-        </w:rPr>
-        <w:t>minimal compensation for exported electricity)</w:t>
-      </w:r>
+      </w:r>
+      <w:r>
+        <w:rPr>
+          <w:rFonts w:ascii="Arial" w:hAnsi="Arial" w:cs="Arial"/>
+          <w:color w:val="000000"/>
+          <w:sz w:val="18"/>
+          <w:szCs w:val="18"/>
+        </w:rPr>
+        <w:t xml:space="preserve">Building permit &amp; Utility </w:t>
+      </w:r>
+      <w:proofErr w:type="gramStart"/>
+      <w:r>
+        <w:rPr>
+          <w:rFonts w:ascii="Arial" w:hAnsi="Arial" w:cs="Arial"/>
+          <w:color w:val="000000"/>
+          <w:sz w:val="18"/>
+          <w:szCs w:val="18"/>
+        </w:rPr>
+        <w:t xml:space="preserve">application </w:t>
+      </w:r>
+      <w:r>
+        <w:rPr>
+          <w:rFonts w:ascii="Arial" w:hAnsi="Arial" w:cs="Arial"/>
+          <w:color w:val="000000"/>
+          <w:sz w:val="18"/>
+          <w:szCs w:val="18"/>
+        </w:rPr>
+        <w:t>({{</w:t>
+      </w:r>
+      <w:proofErr w:type="gramEnd"/>
+      <w:r>
+        <w:rPr>
+          <w:rFonts w:ascii="Arial" w:hAnsi="Arial" w:cs="Arial"/>
+          <w:color w:val="000000"/>
+          <w:sz w:val="18"/>
+          <w:szCs w:val="18"/>
+        </w:rPr>
+        <w:t>UTILITY_APPLICATION_</w:t>
+      </w:r>
+      <w:proofErr w:type="gramStart"/>
+      <w:r>
+        <w:rPr>
+          <w:rFonts w:ascii="Arial" w:hAnsi="Arial" w:cs="Arial"/>
+          <w:color w:val="000000"/>
+          <w:sz w:val="18"/>
+          <w:szCs w:val="18"/>
+        </w:rPr>
+        <w:t>DESCRIPTION}})</w:t>
+      </w:r>
+      <w:proofErr w:type="gramEnd"/>
     </w:p>
     <w:p>
       <w:pPr>
@@ -2469,7 +2550,49 @@
           <w:sz w:val="16"/>
           <w:szCs w:val="16"/>
         </w:rPr>
-        <w:t xml:space="preserve">Actual time of use will determine monthly bill reduction. Solar Billing per MID NEM2 may increase billing beyond the estimated bill amounts shown in the attached analysis.  Please do consider your usage patterns as they can have an effect on the financial performance of the proposed system.  Solar system will NOT reliably reduce demand fees, connected load charges, or meter fee.  </w:t>
+        <w:t xml:space="preserve">Actual time of use will determine monthly bill reduction. Solar Billing per </w:t>
+      </w:r>
+      <w:r>
+        <w:rPr>
+          <w:rFonts w:ascii="Arial" w:hAnsi="Arial" w:cs="Arial"/>
+          <w:b/>
+          <w:i/>
+          <w:sz w:val="16"/>
+          <w:szCs w:val="16"/>
+        </w:rPr>
+        <w:t>{{UTILITY_NEM}}</w:t>
+      </w:r>
+      <w:r>
+        <w:rPr>
+          <w:rFonts w:ascii="Arial" w:hAnsi="Arial" w:cs="Arial"/>
+          <w:b/>
+          <w:i/>
+          <w:sz w:val="16"/>
+          <w:szCs w:val="16"/>
+        </w:rPr>
+        <w:t xml:space="preserve"> may increase billing beyond the estimated bill amounts shown in the attached analysis.  Please do consider your usage patterns as they can </w:t>
+      </w:r>
+      <w:proofErr w:type="gramStart"/>
+      <w:r>
+        <w:rPr>
+          <w:rFonts w:ascii="Arial" w:hAnsi="Arial" w:cs="Arial"/>
+          <w:b/>
+          <w:i/>
+          <w:sz w:val="16"/>
+          <w:szCs w:val="16"/>
+        </w:rPr>
+        <w:t>have an effect on</w:t>
+      </w:r>
+      <w:proofErr w:type="gramEnd"/>
+      <w:r>
+        <w:rPr>
+          <w:rFonts w:ascii="Arial" w:hAnsi="Arial" w:cs="Arial"/>
+          <w:b/>
+          <w:i/>
+          <w:sz w:val="16"/>
+          <w:szCs w:val="16"/>
+        </w:rPr>
+        <w:t xml:space="preserve"> the financial performance of the proposed system.  Solar system will NOT reliably reduce demand fees, connected load charges, or meter fee.  </w:t>
       </w:r>
       <w:r>
         <w:rPr>
@@ -2628,7 +2751,23 @@
           <w:sz w:val="17"/>
           <w:szCs w:val="17"/>
         </w:rPr>
-        <w:t xml:space="preserve">warranty on panels and micro-inverters.  Mid-State Solar shall additionally provide a labor warranty for its workmanship for 10 years.  Please refer to product literature for technical specifications, installation requirements and warranties.  </w:t>
+        <w:t>warranty on panels and micro-inverters.  Mid-State Solar shall additionally provide a labor warranty for its workmanship for 10 years.  Please refer to product literature for technical specifications, installation requirements</w:t>
+      </w:r>
+      <w:r>
+        <w:rPr>
+          <w:rFonts w:ascii="Arial" w:hAnsi="Arial" w:cs="Arial"/>
+          <w:sz w:val="17"/>
+          <w:szCs w:val="17"/>
+        </w:rPr>
+        <w:t>,</w:t>
+      </w:r>
+      <w:r>
+        <w:rPr>
+          <w:rFonts w:ascii="Arial" w:hAnsi="Arial" w:cs="Arial"/>
+          <w:sz w:val="17"/>
+          <w:szCs w:val="17"/>
+        </w:rPr>
+        <w:t xml:space="preserve"> and warranties.  </w:t>
       </w:r>
     </w:p>
     <w:p>
@@ -2893,7 +3032,25 @@
           <w:sz w:val="18"/>
           <w:szCs w:val="18"/>
         </w:rPr>
-        <w:t xml:space="preserve"> house wall </w:t>
+        <w:t xml:space="preserve"> house </w:t>
+      </w:r>
+      <w:proofErr w:type="gramStart"/>
+      <w:r>
+        <w:rPr>
+          <w:rFonts w:ascii="Arial" w:hAnsi="Arial" w:cs="Arial"/>
+          <w:sz w:val="18"/>
+          <w:szCs w:val="18"/>
+        </w:rPr>
+        <w:t>wall</w:t>
+      </w:r>
+      <w:proofErr w:type="gramEnd"/>
+      <w:r>
+        <w:rPr>
+          <w:rFonts w:ascii="Arial" w:hAnsi="Arial" w:cs="Arial"/>
+          <w:sz w:val="18"/>
+          <w:szCs w:val="18"/>
+        </w:rPr>
+        <w:t xml:space="preserve"> </w:t>
       </w:r>
       <w:r>
         <w:rPr>
@@ -3132,15 +3289,16 @@
           <w:sz w:val="17"/>
           <w:szCs w:val="17"/>
         </w:rPr>
-        <w:t>{{BATTERY_WARRANTY}}</w:t>
-      </w:r>
+        <w:t>{{BATTERY_</w:t>
+      </w:r>
+      <w:proofErr w:type="gramStart"/>
       <w:r>
         <w:rPr>
           <w:rFonts w:ascii="Arial" w:hAnsi="Arial" w:cs="Arial"/>
           <w:sz w:val="17"/>
           <w:szCs w:val="17"/>
         </w:rPr>
-        <w:t xml:space="preserve">-year or </w:t>
+        <w:t>WARRANTY}}</w:t>
       </w:r>
       <w:r>
         <w:rPr>
@@ -3148,15 +3306,16 @@
           <w:sz w:val="17"/>
           <w:szCs w:val="17"/>
         </w:rPr>
-        <w:t>{{BATTERY_WARRANTY_CYCLES}}</w:t>
-      </w:r>
+        <w:t>-</w:t>
+      </w:r>
+      <w:proofErr w:type="gramEnd"/>
       <w:r>
         <w:rPr>
           <w:rFonts w:ascii="Arial" w:hAnsi="Arial" w:cs="Arial"/>
           <w:sz w:val="17"/>
           <w:szCs w:val="17"/>
         </w:rPr>
-        <w:t xml:space="preserve">-cycle warranty for minimum </w:t>
+        <w:t xml:space="preserve">year or </w:t>
       </w:r>
       <w:r>
         <w:rPr>
@@ -3164,15 +3323,16 @@
           <w:sz w:val="17"/>
           <w:szCs w:val="17"/>
         </w:rPr>
-        <w:t>{{</w:t>
-      </w:r>
+        <w:t>{{BATTERY_WARRANTY_</w:t>
+      </w:r>
+      <w:proofErr w:type="gramStart"/>
       <w:r>
         <w:rPr>
           <w:rFonts w:ascii="Arial" w:hAnsi="Arial" w:cs="Arial"/>
           <w:sz w:val="17"/>
           <w:szCs w:val="17"/>
         </w:rPr>
-        <w:t>BATTERY_WARRANTY_</w:t>
+        <w:t>CYCLES}}</w:t>
       </w:r>
       <w:r>
         <w:rPr>
@@ -3180,15 +3340,58 @@
           <w:sz w:val="17"/>
           <w:szCs w:val="17"/>
         </w:rPr>
-        <w:t>CAPACITY}}</w:t>
-      </w:r>
+        <w:t>-</w:t>
+      </w:r>
+      <w:proofErr w:type="gramEnd"/>
       <w:r>
         <w:rPr>
           <w:rFonts w:ascii="Arial" w:hAnsi="Arial" w:cs="Arial"/>
           <w:sz w:val="17"/>
           <w:szCs w:val="17"/>
         </w:rPr>
-        <w:t>% storage capacity. Please refer to product literature for technical specifications, installation requirements and warranties.</w:t>
+        <w:t xml:space="preserve">cycle warranty for minimum </w:t>
+      </w:r>
+      <w:r>
+        <w:rPr>
+          <w:rFonts w:ascii="Arial" w:hAnsi="Arial" w:cs="Arial"/>
+          <w:sz w:val="17"/>
+          <w:szCs w:val="17"/>
+        </w:rPr>
+        <w:t>{{</w:t>
+      </w:r>
+      <w:r>
+        <w:rPr>
+          <w:rFonts w:ascii="Arial" w:hAnsi="Arial" w:cs="Arial"/>
+          <w:sz w:val="17"/>
+          <w:szCs w:val="17"/>
+        </w:rPr>
+        <w:t>BATTERY_WARRANTY_</w:t>
+      </w:r>
+      <w:proofErr w:type="gramStart"/>
+      <w:r>
+        <w:rPr>
+          <w:rFonts w:ascii="Arial" w:hAnsi="Arial" w:cs="Arial"/>
+          <w:sz w:val="17"/>
+          <w:szCs w:val="17"/>
+        </w:rPr>
+        <w:t>CAPACITY}}</w:t>
+      </w:r>
+      <w:r>
+        <w:rPr>
+          <w:rFonts w:ascii="Arial" w:hAnsi="Arial" w:cs="Arial"/>
+          <w:sz w:val="17"/>
+          <w:szCs w:val="17"/>
+        </w:rPr>
+        <w:t>%</w:t>
+      </w:r>
+      <w:proofErr w:type="gramEnd"/>
+      <w:r>
+        <w:rPr>
+          <w:rFonts w:ascii="Arial" w:hAnsi="Arial" w:cs="Arial"/>
+          <w:sz w:val="17"/>
+          <w:szCs w:val="17"/>
+        </w:rPr>
+        <w:t xml:space="preserve"> storage capacity. Please refer to product literature for technical specifications, installation requirements and warranties.</w:t>
       </w:r>
     </w:p>
     <w:p>
@@ -3505,7 +3708,17 @@
           <w:sz w:val="18"/>
           <w:szCs w:val="18"/>
         </w:rPr>
-        <w:t>Estimated Monthly Loan Payment:</w:t>
+        <w:t xml:space="preserve">Estimated Monthly Loan </w:t>
+      </w:r>
+      <w:proofErr w:type="gramStart"/>
+      <w:r>
+        <w:rPr>
+          <w:rFonts w:ascii="Arial" w:hAnsi="Arial" w:cs="Arial"/>
+          <w:i/>
+          <w:sz w:val="18"/>
+          <w:szCs w:val="18"/>
+        </w:rPr>
+        <w:t>Payment:</w:t>
       </w:r>
       <w:r>
         <w:rPr>
@@ -3525,7 +3738,36 @@
           <w:sz w:val="18"/>
           <w:szCs w:val="18"/>
         </w:rPr>
-        <w:t>{{LOAN_PAYMENT}}</w:t>
+        <w:t>{{</w:t>
+      </w:r>
+      <w:proofErr w:type="gramEnd"/>
+      <w:r>
+        <w:rPr>
+          <w:rFonts w:ascii="Arial" w:hAnsi="Arial" w:cs="Arial"/>
+          <w:i/>
+          <w:sz w:val="18"/>
+          <w:szCs w:val="18"/>
+        </w:rPr>
+        <w:t>LOAN_</w:t>
+      </w:r>
+      <w:r>
+        <w:rPr>
+          <w:rFonts w:ascii="Arial" w:hAnsi="Arial" w:cs="Arial"/>
+          <w:i/>
+          <w:sz w:val="18"/>
+          <w:szCs w:val="18"/>
+        </w:rPr>
+        <w:t>MONTHLY_</w:t>
+      </w:r>
+      <w:proofErr w:type="gramStart"/>
+      <w:r>
+        <w:rPr>
+          <w:rFonts w:ascii="Arial" w:hAnsi="Arial" w:cs="Arial"/>
+          <w:i/>
+          <w:sz w:val="18"/>
+          <w:szCs w:val="18"/>
+        </w:rPr>
+        <w:t>PAYMENT}}</w:t>
       </w:r>
       <w:r>
         <w:rPr>
@@ -3536,6 +3778,7 @@
         </w:rPr>
         <w:t>/</w:t>
       </w:r>
+      <w:proofErr w:type="gramEnd"/>
       <w:r>
         <w:rPr>
           <w:rFonts w:ascii="Arial" w:hAnsi="Arial" w:cs="Arial"/>
@@ -3577,7 +3820,27 @@
           <w:sz w:val="18"/>
           <w:szCs w:val="18"/>
         </w:rPr>
-        <w:t>All terms subject to credit approval and current financing rates.  Rates quoted assume FICO 720+.</w:t>
+        <w:t xml:space="preserve">All terms </w:t>
+      </w:r>
+      <w:proofErr w:type="gramStart"/>
+      <w:r>
+        <w:rPr>
+          <w:rFonts w:ascii="Arial" w:hAnsi="Arial" w:cs="Arial"/>
+          <w:i/>
+          <w:sz w:val="18"/>
+          <w:szCs w:val="18"/>
+        </w:rPr>
+        <w:t>subject</w:t>
+      </w:r>
+      <w:proofErr w:type="gramEnd"/>
+      <w:r>
+        <w:rPr>
+          <w:rFonts w:ascii="Arial" w:hAnsi="Arial" w:cs="Arial"/>
+          <w:i/>
+          <w:sz w:val="18"/>
+          <w:szCs w:val="18"/>
+        </w:rPr>
+        <w:t xml:space="preserve"> to credit approval and current financing rates.  Rates quoted assume FICO 720+.</w:t>
       </w:r>
     </w:p>
     <w:p>
@@ -3645,7 +3908,25 @@
           <w:sz w:val="18"/>
           <w:szCs w:val="18"/>
         </w:rPr>
-        <w:t>Thank you for considering Mid-State Solar for your solar energy solutions.  We have served the Central Valley continuously since 1977, providing solar energy systems to thousands of satisfied customers.  We sincerely appreciate this opportunity and look forward to working with you on this project.  If you have any questions regarding this bid, please call me at 209.551.7800.</w:t>
+        <w:t xml:space="preserve">Thank you for considering Mid-State Solar for your solar energy solutions.  We have served the Central Valley continuously since 1977, providing solar energy systems to thousands of satisfied customers.  We sincerely appreciate this opportunity and look forward to working with you on this project.  If you have any questions regarding this bid, please call me </w:t>
+      </w:r>
+      <w:proofErr w:type="gramStart"/>
+      <w:r>
+        <w:rPr>
+          <w:rFonts w:ascii="Arial" w:hAnsi="Arial" w:cs="Arial"/>
+          <w:sz w:val="18"/>
+          <w:szCs w:val="18"/>
+        </w:rPr>
+        <w:t>at</w:t>
+      </w:r>
+      <w:proofErr w:type="gramEnd"/>
+      <w:r>
+        <w:rPr>
+          <w:rFonts w:ascii="Arial" w:hAnsi="Arial" w:cs="Arial"/>
+          <w:sz w:val="18"/>
+          <w:szCs w:val="18"/>
+        </w:rPr>
+        <w:t xml:space="preserve"> 209.551.7800.</w:t>
       </w:r>
     </w:p>
     <w:p>
@@ -3783,8 +4064,7 @@
       <w:footerReference w:type="default" r:id="rId10"/>
       <w:type w:val="continuous"/>
       <w:pgSz w:w="12240" w:h="15840"/>
-      <w:pgMar w:top="720" w:right="1530" w:bottom="432" w:left="1152" w:header="1440" w:footer="0" w:gutter="0"/>
-      <w:paperSrc w:first="15" w:other="15"/>
+      <w:pgMar w:top="720" w:right="1080" w:bottom="360" w:left="1080" w:header="1440" w:footer="0" w:gutter="0"/>
       <w:cols w:space="720"/>
       <w:noEndnote/>
     </w:sectPr>

</xml_diff>

<commit_message>
Updated variable handling with settings file
</commit_message>
<xml_diff>
--- a/src/templates/cover_letter_2.docx
+++ b/src/templates/cover_letter_2.docx
@@ -1,6 +1,6 @@
 
 <file path=word/document.xml><?xml version="1.0" encoding="utf-8"?>
-<w:document xmlns:wpc="http://schemas.microsoft.com/office/word/2010/wordprocessingCanvas" xmlns:cx="http://schemas.microsoft.com/office/drawing/2014/chartex" xmlns:cx1="http://schemas.microsoft.com/office/drawing/2015/9/8/chartex" xmlns:cx2="http://schemas.microsoft.com/office/drawing/2015/10/21/chartex" xmlns:cx3="http://schemas.microsoft.com/office/drawing/2016/5/9/chartex" xmlns:cx4="http://schemas.microsoft.com/office/drawing/2016/5/10/chartex" xmlns:cx5="http://schemas.microsoft.com/office/drawing/2016/5/11/chartex" xmlns:cx6="http://schemas.microsoft.com/office/drawing/2016/5/12/chartex" xmlns:cx7="http://schemas.microsoft.com/office/drawing/2016/5/13/chartex" xmlns:cx8="http://schemas.microsoft.com/office/drawing/2016/5/14/chartex" xmlns:mc="http://schemas.openxmlformats.org/markup-compatibility/2006" xmlns:aink="http://schemas.microsoft.com/office/drawing/2016/ink" xmlns:am3d="http://schemas.microsoft.com/office/drawing/2017/model3d" xmlns:o="urn:schemas-microsoft-com:office:office" xmlns:oel="http://schemas.microsoft.com/office/2019/extlst" xmlns:r="http://schemas.openxmlformats.org/officeDocument/2006/relationships" xmlns:m="http://schemas.openxmlformats.org/officeDocument/2006/math" xmlns:v="urn:schemas-microsoft-com:vml" xmlns:wp14="http://schemas.microsoft.com/office/word/2010/wordprocessingDrawing" xmlns:wp="http://schemas.openxmlformats.org/drawingml/2006/wordprocessingDrawing" xmlns:w10="urn:schemas-microsoft-com:office:word" xmlns:w="http://schemas.openxmlformats.org/wordprocessingml/2006/main" xmlns:w14="http://schemas.microsoft.com/office/word/2010/wordml" xmlns:w15="http://schemas.microsoft.com/office/word/2012/wordml" xmlns:w16cex="http://schemas.microsoft.com/office/word/2018/wordml/cex" xmlns:w16cid="http://schemas.microsoft.com/office/word/2016/wordml/cid" xmlns:w16="http://schemas.microsoft.com/office/word/2018/wordml" xmlns:w16du="http://schemas.microsoft.com/office/word/2023/wordml/word16du" xmlns:w16sdtdh="http://schemas.microsoft.com/office/word/2020/wordml/sdtdatahash" xmlns:w16sdtfl="http://schemas.microsoft.com/office/word/2024/wordml/sdtformatlock" xmlns:w16se="http://schemas.microsoft.com/office/word/2015/wordml/symex" xmlns:wpg="http://schemas.microsoft.com/office/word/2010/wordprocessingGroup" xmlns:wpi="http://schemas.microsoft.com/office/word/2010/wordprocessingInk" xmlns:wne="http://schemas.microsoft.com/office/word/2006/wordml" xmlns:wps="http://schemas.microsoft.com/office/word/2010/wordprocessingShape" mc:Ignorable="w14 w15 w16se w16cid w16 w16cex w16sdtdh w16sdtfl w16du wp14">
+<w:document xmlns:wpc="http://schemas.microsoft.com/office/word/2010/wordprocessingCanvas" xmlns:cx="http://schemas.microsoft.com/office/drawing/2014/chartex" xmlns:cx1="http://schemas.microsoft.com/office/drawing/2015/9/8/chartex" xmlns:cx2="http://schemas.microsoft.com/office/drawing/2015/10/21/chartex" xmlns:cx3="http://schemas.microsoft.com/office/drawing/2016/5/9/chartex" xmlns:cx4="http://schemas.microsoft.com/office/drawing/2016/5/10/chartex" xmlns:cx5="http://schemas.microsoft.com/office/drawing/2016/5/11/chartex" xmlns:cx6="http://schemas.microsoft.com/office/drawing/2016/5/12/chartex" xmlns:cx7="http://schemas.microsoft.com/office/drawing/2016/5/13/chartex" xmlns:cx8="http://schemas.microsoft.com/office/drawing/2016/5/14/chartex" xmlns:mc="http://schemas.openxmlformats.org/markup-compatibility/2006" xmlns:aink="http://schemas.microsoft.com/office/drawing/2016/ink" xmlns:am3d="http://schemas.microsoft.com/office/drawing/2017/model3d" xmlns:o="urn:schemas-microsoft-com:office:office" xmlns:oel="http://schemas.microsoft.com/office/2019/extlst" xmlns:r="http://schemas.openxmlformats.org/officeDocument/2006/relationships" xmlns:m="http://schemas.openxmlformats.org/officeDocument/2006/math" xmlns:v="urn:schemas-microsoft-com:vml" xmlns:wp14="http://schemas.microsoft.com/office/word/2010/wordprocessingDrawing" xmlns:wp="http://schemas.openxmlformats.org/drawingml/2006/wordprocessingDrawing" xmlns:w10="urn:schemas-microsoft-com:office:word" xmlns:w="http://schemas.openxmlformats.org/wordprocessingml/2006/main" xmlns:w14="http://schemas.microsoft.com/office/word/2010/wordml" xmlns:w15="http://schemas.microsoft.com/office/word/2012/wordml" xmlns:w16cei="http://schemas.microsoft.com/office/word/2026/wordml/cei" xmlns:w16cex="http://schemas.microsoft.com/office/word/2018/wordml/cex" xmlns:w16cid="http://schemas.microsoft.com/office/word/2016/wordml/cid" xmlns:w16="http://schemas.microsoft.com/office/word/2018/wordml" xmlns:w16du="http://schemas.microsoft.com/office/word/2023/wordml/word16du" xmlns:w16sdtdh="http://schemas.microsoft.com/office/word/2020/wordml/sdtdatahash" xmlns:w16sdtfl="http://schemas.microsoft.com/office/word/2024/wordml/sdtformatlock" xmlns:w16se="http://schemas.microsoft.com/office/word/2015/wordml/symex" xmlns:wpg="http://schemas.microsoft.com/office/word/2010/wordprocessingGroup" xmlns:wpi="http://schemas.microsoft.com/office/word/2010/wordprocessingInk" xmlns:wne="http://schemas.microsoft.com/office/word/2006/wordml" xmlns:wps="http://schemas.microsoft.com/office/word/2010/wordprocessingShape" mc:Ignorable="w14 w15 w16se w16cid w16 w16cex w16sdtdh w16sdtfl w16du wp14">
   <w:body>
     <w:p>
       <w:pPr>
@@ -43,7 +43,7 @@
             <v:path o:extrusionok="f" gradientshapeok="t" o:connecttype="rect"/>
             <o:lock v:ext="edit" aspectratio="t"/>
           </v:shapetype>
-          <v:shape id="_x0000_i1025" type="#_x0000_t75" style="width:211.1pt;height:61.65pt">
+          <v:shape id="_x0000_i1025" type="#_x0000_t75" style="width:211.3pt;height:61.7pt">
             <v:imagedata r:id="rId8" o:title=""/>
           </v:shape>
         </w:pict>
@@ -461,7 +461,25 @@
           <w:i/>
           <w:sz w:val="20"/>
         </w:rPr>
-        <w:t>{{PANEL_MANUFACTURER}}</w:t>
+        <w:t>{{PANEL_MANUFACTURER</w:t>
+      </w:r>
+      <w:r>
+        <w:rPr>
+          <w:rFonts w:ascii="Arial" w:hAnsi="Arial" w:cs="Arial"/>
+          <w:b/>
+          <w:i/>
+          <w:sz w:val="20"/>
+        </w:rPr>
+        <w:t>_UPPERCASE</w:t>
+      </w:r>
+      <w:r>
+        <w:rPr>
+          <w:rFonts w:ascii="Arial" w:hAnsi="Arial" w:cs="Arial"/>
+          <w:b/>
+          <w:i/>
+          <w:sz w:val="20"/>
+        </w:rPr>
+        <w:t>}}</w:t>
       </w:r>
       <w:r>
         <w:rPr>
@@ -506,7 +524,25 @@
           <w:i/>
           <w:sz w:val="20"/>
         </w:rPr>
-        <w:t>{{INVERTER_MANUFACTURER}}</w:t>
+        <w:t>{{INVERTER_MANUFACTURER</w:t>
+      </w:r>
+      <w:r>
+        <w:rPr>
+          <w:rFonts w:ascii="Arial" w:hAnsi="Arial" w:cs="Arial"/>
+          <w:b/>
+          <w:i/>
+          <w:sz w:val="20"/>
+        </w:rPr>
+        <w:t>_UPPERCASE</w:t>
+      </w:r>
+      <w:r>
+        <w:rPr>
+          <w:rFonts w:ascii="Arial" w:hAnsi="Arial" w:cs="Arial"/>
+          <w:b/>
+          <w:i/>
+          <w:sz w:val="20"/>
+        </w:rPr>
+        <w:t>}}</w:t>
       </w:r>
       <w:r>
         <w:rPr>
@@ -3234,7 +3270,49 @@
           <w:sz w:val="18"/>
           <w:szCs w:val="18"/>
         </w:rPr>
-        <w:t>{{EXPANSION_OPTIONS}}</w:t>
+        <w:t>Additional IQ10C Battery Unit: $8,340</w:t>
+      </w:r>
+    </w:p>
+    <w:p>
+      <w:pPr>
+        <w:autoSpaceDE w:val="0"/>
+        <w:autoSpaceDN w:val="0"/>
+        <w:adjustRightInd w:val="0"/>
+        <w:ind w:left="-180"/>
+        <w:rPr>
+          <w:rFonts w:ascii="Arial" w:hAnsi="Arial" w:cs="Arial"/>
+          <w:sz w:val="18"/>
+          <w:szCs w:val="18"/>
+        </w:rPr>
+      </w:pPr>
+      <w:r>
+        <w:rPr>
+          <w:rFonts w:ascii="Arial" w:hAnsi="Arial" w:cs="Arial"/>
+          <w:sz w:val="18"/>
+          <w:szCs w:val="18"/>
+        </w:rPr>
+        <w:t>Dedicated Subpanel (Critical Loads Backup) for Off-Grid use: $3,650</w:t>
+      </w:r>
+    </w:p>
+    <w:p>
+      <w:pPr>
+        <w:autoSpaceDE w:val="0"/>
+        <w:autoSpaceDN w:val="0"/>
+        <w:adjustRightInd w:val="0"/>
+        <w:ind w:left="-180"/>
+        <w:rPr>
+          <w:rFonts w:ascii="Arial" w:hAnsi="Arial" w:cs="Arial"/>
+          <w:sz w:val="18"/>
+          <w:szCs w:val="18"/>
+        </w:rPr>
+      </w:pPr>
+      <w:r>
+        <w:rPr>
+          <w:rFonts w:ascii="Arial" w:hAnsi="Arial" w:cs="Arial"/>
+          <w:sz w:val="18"/>
+          <w:szCs w:val="18"/>
+        </w:rPr>
+        <w:t>IQ60 EV Charger w/ Smart Solar Interface: $1,860</w:t>
       </w:r>
     </w:p>
     <w:p>
@@ -4073,7 +4151,7 @@
 </file>
 
 <file path=word/endnotes.xml><?xml version="1.0" encoding="utf-8"?>
-<w:endnotes xmlns:wpc="http://schemas.microsoft.com/office/word/2010/wordprocessingCanvas" xmlns:cx="http://schemas.microsoft.com/office/drawing/2014/chartex" xmlns:cx1="http://schemas.microsoft.com/office/drawing/2015/9/8/chartex" xmlns:cx2="http://schemas.microsoft.com/office/drawing/2015/10/21/chartex" xmlns:cx3="http://schemas.microsoft.com/office/drawing/2016/5/9/chartex" xmlns:cx4="http://schemas.microsoft.com/office/drawing/2016/5/10/chartex" xmlns:cx5="http://schemas.microsoft.com/office/drawing/2016/5/11/chartex" xmlns:cx6="http://schemas.microsoft.com/office/drawing/2016/5/12/chartex" xmlns:cx7="http://schemas.microsoft.com/office/drawing/2016/5/13/chartex" xmlns:cx8="http://schemas.microsoft.com/office/drawing/2016/5/14/chartex" xmlns:mc="http://schemas.openxmlformats.org/markup-compatibility/2006" xmlns:aink="http://schemas.microsoft.com/office/drawing/2016/ink" xmlns:am3d="http://schemas.microsoft.com/office/drawing/2017/model3d" xmlns:o="urn:schemas-microsoft-com:office:office" xmlns:oel="http://schemas.microsoft.com/office/2019/extlst" xmlns:r="http://schemas.openxmlformats.org/officeDocument/2006/relationships" xmlns:m="http://schemas.openxmlformats.org/officeDocument/2006/math" xmlns:v="urn:schemas-microsoft-com:vml" xmlns:wp14="http://schemas.microsoft.com/office/word/2010/wordprocessingDrawing" xmlns:wp="http://schemas.openxmlformats.org/drawingml/2006/wordprocessingDrawing" xmlns:w10="urn:schemas-microsoft-com:office:word" xmlns:w="http://schemas.openxmlformats.org/wordprocessingml/2006/main" xmlns:w14="http://schemas.microsoft.com/office/word/2010/wordml" xmlns:w15="http://schemas.microsoft.com/office/word/2012/wordml" xmlns:w16cex="http://schemas.microsoft.com/office/word/2018/wordml/cex" xmlns:w16cid="http://schemas.microsoft.com/office/word/2016/wordml/cid" xmlns:w16="http://schemas.microsoft.com/office/word/2018/wordml" xmlns:w16du="http://schemas.microsoft.com/office/word/2023/wordml/word16du" xmlns:w16sdtdh="http://schemas.microsoft.com/office/word/2020/wordml/sdtdatahash" xmlns:w16sdtfl="http://schemas.microsoft.com/office/word/2024/wordml/sdtformatlock" xmlns:w16se="http://schemas.microsoft.com/office/word/2015/wordml/symex" xmlns:wpg="http://schemas.microsoft.com/office/word/2010/wordprocessingGroup" xmlns:wpi="http://schemas.microsoft.com/office/word/2010/wordprocessingInk" xmlns:wne="http://schemas.microsoft.com/office/word/2006/wordml" xmlns:wps="http://schemas.microsoft.com/office/word/2010/wordprocessingShape" mc:Ignorable="w14 w15 w16se w16cid w16 w16cex w16sdtdh w16sdtfl w16du wp14">
+<w:endnotes xmlns:wpc="http://schemas.microsoft.com/office/word/2010/wordprocessingCanvas" xmlns:cx="http://schemas.microsoft.com/office/drawing/2014/chartex" xmlns:cx1="http://schemas.microsoft.com/office/drawing/2015/9/8/chartex" xmlns:cx2="http://schemas.microsoft.com/office/drawing/2015/10/21/chartex" xmlns:cx3="http://schemas.microsoft.com/office/drawing/2016/5/9/chartex" xmlns:cx4="http://schemas.microsoft.com/office/drawing/2016/5/10/chartex" xmlns:cx5="http://schemas.microsoft.com/office/drawing/2016/5/11/chartex" xmlns:cx6="http://schemas.microsoft.com/office/drawing/2016/5/12/chartex" xmlns:cx7="http://schemas.microsoft.com/office/drawing/2016/5/13/chartex" xmlns:cx8="http://schemas.microsoft.com/office/drawing/2016/5/14/chartex" xmlns:mc="http://schemas.openxmlformats.org/markup-compatibility/2006" xmlns:aink="http://schemas.microsoft.com/office/drawing/2016/ink" xmlns:am3d="http://schemas.microsoft.com/office/drawing/2017/model3d" xmlns:o="urn:schemas-microsoft-com:office:office" xmlns:oel="http://schemas.microsoft.com/office/2019/extlst" xmlns:r="http://schemas.openxmlformats.org/officeDocument/2006/relationships" xmlns:m="http://schemas.openxmlformats.org/officeDocument/2006/math" xmlns:v="urn:schemas-microsoft-com:vml" xmlns:wp14="http://schemas.microsoft.com/office/word/2010/wordprocessingDrawing" xmlns:wp="http://schemas.openxmlformats.org/drawingml/2006/wordprocessingDrawing" xmlns:w10="urn:schemas-microsoft-com:office:word" xmlns:w="http://schemas.openxmlformats.org/wordprocessingml/2006/main" xmlns:w14="http://schemas.microsoft.com/office/word/2010/wordml" xmlns:w15="http://schemas.microsoft.com/office/word/2012/wordml" xmlns:w16cei="http://schemas.microsoft.com/office/word/2026/wordml/cei" xmlns:w16cex="http://schemas.microsoft.com/office/word/2018/wordml/cex" xmlns:w16cid="http://schemas.microsoft.com/office/word/2016/wordml/cid" xmlns:w16="http://schemas.microsoft.com/office/word/2018/wordml" xmlns:w16du="http://schemas.microsoft.com/office/word/2023/wordml/word16du" xmlns:w16sdtdh="http://schemas.microsoft.com/office/word/2020/wordml/sdtdatahash" xmlns:w16sdtfl="http://schemas.microsoft.com/office/word/2024/wordml/sdtformatlock" xmlns:w16se="http://schemas.microsoft.com/office/word/2015/wordml/symex" xmlns:wpg="http://schemas.microsoft.com/office/word/2010/wordprocessingGroup" xmlns:wpi="http://schemas.microsoft.com/office/word/2010/wordprocessingInk" xmlns:wne="http://schemas.microsoft.com/office/word/2006/wordml" xmlns:wps="http://schemas.microsoft.com/office/word/2010/wordprocessingShape" mc:Ignorable="w14 w15 w16se w16cid w16 w16cex w16sdtdh w16sdtfl w16du wp14">
   <w:endnote w:type="separator" w:id="-1">
     <w:p>
       <w:r>
@@ -4092,7 +4170,7 @@
 </file>
 
 <file path=word/footer1.xml><?xml version="1.0" encoding="utf-8"?>
-<w:ftr xmlns:wpc="http://schemas.microsoft.com/office/word/2010/wordprocessingCanvas" xmlns:cx="http://schemas.microsoft.com/office/drawing/2014/chartex" xmlns:cx1="http://schemas.microsoft.com/office/drawing/2015/9/8/chartex" xmlns:cx2="http://schemas.microsoft.com/office/drawing/2015/10/21/chartex" xmlns:cx3="http://schemas.microsoft.com/office/drawing/2016/5/9/chartex" xmlns:cx4="http://schemas.microsoft.com/office/drawing/2016/5/10/chartex" xmlns:cx5="http://schemas.microsoft.com/office/drawing/2016/5/11/chartex" xmlns:cx6="http://schemas.microsoft.com/office/drawing/2016/5/12/chartex" xmlns:cx7="http://schemas.microsoft.com/office/drawing/2016/5/13/chartex" xmlns:cx8="http://schemas.microsoft.com/office/drawing/2016/5/14/chartex" xmlns:mc="http://schemas.openxmlformats.org/markup-compatibility/2006" xmlns:aink="http://schemas.microsoft.com/office/drawing/2016/ink" xmlns:am3d="http://schemas.microsoft.com/office/drawing/2017/model3d" xmlns:o="urn:schemas-microsoft-com:office:office" xmlns:oel="http://schemas.microsoft.com/office/2019/extlst" xmlns:r="http://schemas.openxmlformats.org/officeDocument/2006/relationships" xmlns:m="http://schemas.openxmlformats.org/officeDocument/2006/math" xmlns:v="urn:schemas-microsoft-com:vml" xmlns:wp14="http://schemas.microsoft.com/office/word/2010/wordprocessingDrawing" xmlns:wp="http://schemas.openxmlformats.org/drawingml/2006/wordprocessingDrawing" xmlns:w10="urn:schemas-microsoft-com:office:word" xmlns:w="http://schemas.openxmlformats.org/wordprocessingml/2006/main" xmlns:w14="http://schemas.microsoft.com/office/word/2010/wordml" xmlns:w15="http://schemas.microsoft.com/office/word/2012/wordml" xmlns:w16cex="http://schemas.microsoft.com/office/word/2018/wordml/cex" xmlns:w16cid="http://schemas.microsoft.com/office/word/2016/wordml/cid" xmlns:w16="http://schemas.microsoft.com/office/word/2018/wordml" xmlns:w16du="http://schemas.microsoft.com/office/word/2023/wordml/word16du" xmlns:w16sdtdh="http://schemas.microsoft.com/office/word/2020/wordml/sdtdatahash" xmlns:w16sdtfl="http://schemas.microsoft.com/office/word/2024/wordml/sdtformatlock" xmlns:w16se="http://schemas.microsoft.com/office/word/2015/wordml/symex" xmlns:wpg="http://schemas.microsoft.com/office/word/2010/wordprocessingGroup" xmlns:wpi="http://schemas.microsoft.com/office/word/2010/wordprocessingInk" xmlns:wne="http://schemas.microsoft.com/office/word/2006/wordml" xmlns:wps="http://schemas.microsoft.com/office/word/2010/wordprocessingShape" mc:Ignorable="w14 w15 w16se w16cid w16 w16cex w16sdtdh w16sdtfl w16du wp14">
+<w:ftr xmlns:wpc="http://schemas.microsoft.com/office/word/2010/wordprocessingCanvas" xmlns:cx="http://schemas.microsoft.com/office/drawing/2014/chartex" xmlns:cx1="http://schemas.microsoft.com/office/drawing/2015/9/8/chartex" xmlns:cx2="http://schemas.microsoft.com/office/drawing/2015/10/21/chartex" xmlns:cx3="http://schemas.microsoft.com/office/drawing/2016/5/9/chartex" xmlns:cx4="http://schemas.microsoft.com/office/drawing/2016/5/10/chartex" xmlns:cx5="http://schemas.microsoft.com/office/drawing/2016/5/11/chartex" xmlns:cx6="http://schemas.microsoft.com/office/drawing/2016/5/12/chartex" xmlns:cx7="http://schemas.microsoft.com/office/drawing/2016/5/13/chartex" xmlns:cx8="http://schemas.microsoft.com/office/drawing/2016/5/14/chartex" xmlns:mc="http://schemas.openxmlformats.org/markup-compatibility/2006" xmlns:aink="http://schemas.microsoft.com/office/drawing/2016/ink" xmlns:am3d="http://schemas.microsoft.com/office/drawing/2017/model3d" xmlns:o="urn:schemas-microsoft-com:office:office" xmlns:oel="http://schemas.microsoft.com/office/2019/extlst" xmlns:r="http://schemas.openxmlformats.org/officeDocument/2006/relationships" xmlns:m="http://schemas.openxmlformats.org/officeDocument/2006/math" xmlns:v="urn:schemas-microsoft-com:vml" xmlns:wp14="http://schemas.microsoft.com/office/word/2010/wordprocessingDrawing" xmlns:wp="http://schemas.openxmlformats.org/drawingml/2006/wordprocessingDrawing" xmlns:w10="urn:schemas-microsoft-com:office:word" xmlns:w="http://schemas.openxmlformats.org/wordprocessingml/2006/main" xmlns:w14="http://schemas.microsoft.com/office/word/2010/wordml" xmlns:w15="http://schemas.microsoft.com/office/word/2012/wordml" xmlns:w16cei="http://schemas.microsoft.com/office/word/2026/wordml/cei" xmlns:w16cex="http://schemas.microsoft.com/office/word/2018/wordml/cex" xmlns:w16cid="http://schemas.microsoft.com/office/word/2016/wordml/cid" xmlns:w16="http://schemas.microsoft.com/office/word/2018/wordml" xmlns:w16du="http://schemas.microsoft.com/office/word/2023/wordml/word16du" xmlns:w16sdtdh="http://schemas.microsoft.com/office/word/2020/wordml/sdtdatahash" xmlns:w16sdtfl="http://schemas.microsoft.com/office/word/2024/wordml/sdtformatlock" xmlns:w16se="http://schemas.microsoft.com/office/word/2015/wordml/symex" xmlns:wpg="http://schemas.microsoft.com/office/word/2010/wordprocessingGroup" xmlns:wpi="http://schemas.microsoft.com/office/word/2010/wordprocessingInk" xmlns:wne="http://schemas.microsoft.com/office/word/2006/wordml" xmlns:wps="http://schemas.microsoft.com/office/word/2010/wordprocessingShape" mc:Ignorable="w14 w15 w16se w16cid w16 w16cex w16sdtdh w16sdtfl w16du wp14">
   <w:p>
     <w:pPr>
       <w:pStyle w:val="Header"/>
@@ -4217,7 +4295,7 @@
 </file>
 
 <file path=word/footnotes.xml><?xml version="1.0" encoding="utf-8"?>
-<w:footnotes xmlns:wpc="http://schemas.microsoft.com/office/word/2010/wordprocessingCanvas" xmlns:cx="http://schemas.microsoft.com/office/drawing/2014/chartex" xmlns:cx1="http://schemas.microsoft.com/office/drawing/2015/9/8/chartex" xmlns:cx2="http://schemas.microsoft.com/office/drawing/2015/10/21/chartex" xmlns:cx3="http://schemas.microsoft.com/office/drawing/2016/5/9/chartex" xmlns:cx4="http://schemas.microsoft.com/office/drawing/2016/5/10/chartex" xmlns:cx5="http://schemas.microsoft.com/office/drawing/2016/5/11/chartex" xmlns:cx6="http://schemas.microsoft.com/office/drawing/2016/5/12/chartex" xmlns:cx7="http://schemas.microsoft.com/office/drawing/2016/5/13/chartex" xmlns:cx8="http://schemas.microsoft.com/office/drawing/2016/5/14/chartex" xmlns:mc="http://schemas.openxmlformats.org/markup-compatibility/2006" xmlns:aink="http://schemas.microsoft.com/office/drawing/2016/ink" xmlns:am3d="http://schemas.microsoft.com/office/drawing/2017/model3d" xmlns:o="urn:schemas-microsoft-com:office:office" xmlns:oel="http://schemas.microsoft.com/office/2019/extlst" xmlns:r="http://schemas.openxmlformats.org/officeDocument/2006/relationships" xmlns:m="http://schemas.openxmlformats.org/officeDocument/2006/math" xmlns:v="urn:schemas-microsoft-com:vml" xmlns:wp14="http://schemas.microsoft.com/office/word/2010/wordprocessingDrawing" xmlns:wp="http://schemas.openxmlformats.org/drawingml/2006/wordprocessingDrawing" xmlns:w10="urn:schemas-microsoft-com:office:word" xmlns:w="http://schemas.openxmlformats.org/wordprocessingml/2006/main" xmlns:w14="http://schemas.microsoft.com/office/word/2010/wordml" xmlns:w15="http://schemas.microsoft.com/office/word/2012/wordml" xmlns:w16cex="http://schemas.microsoft.com/office/word/2018/wordml/cex" xmlns:w16cid="http://schemas.microsoft.com/office/word/2016/wordml/cid" xmlns:w16="http://schemas.microsoft.com/office/word/2018/wordml" xmlns:w16du="http://schemas.microsoft.com/office/word/2023/wordml/word16du" xmlns:w16sdtdh="http://schemas.microsoft.com/office/word/2020/wordml/sdtdatahash" xmlns:w16sdtfl="http://schemas.microsoft.com/office/word/2024/wordml/sdtformatlock" xmlns:w16se="http://schemas.microsoft.com/office/word/2015/wordml/symex" xmlns:wpg="http://schemas.microsoft.com/office/word/2010/wordprocessingGroup" xmlns:wpi="http://schemas.microsoft.com/office/word/2010/wordprocessingInk" xmlns:wne="http://schemas.microsoft.com/office/word/2006/wordml" xmlns:wps="http://schemas.microsoft.com/office/word/2010/wordprocessingShape" mc:Ignorable="w14 w15 w16se w16cid w16 w16cex w16sdtdh w16sdtfl w16du wp14">
+<w:footnotes xmlns:wpc="http://schemas.microsoft.com/office/word/2010/wordprocessingCanvas" xmlns:cx="http://schemas.microsoft.com/office/drawing/2014/chartex" xmlns:cx1="http://schemas.microsoft.com/office/drawing/2015/9/8/chartex" xmlns:cx2="http://schemas.microsoft.com/office/drawing/2015/10/21/chartex" xmlns:cx3="http://schemas.microsoft.com/office/drawing/2016/5/9/chartex" xmlns:cx4="http://schemas.microsoft.com/office/drawing/2016/5/10/chartex" xmlns:cx5="http://schemas.microsoft.com/office/drawing/2016/5/11/chartex" xmlns:cx6="http://schemas.microsoft.com/office/drawing/2016/5/12/chartex" xmlns:cx7="http://schemas.microsoft.com/office/drawing/2016/5/13/chartex" xmlns:cx8="http://schemas.microsoft.com/office/drawing/2016/5/14/chartex" xmlns:mc="http://schemas.openxmlformats.org/markup-compatibility/2006" xmlns:aink="http://schemas.microsoft.com/office/drawing/2016/ink" xmlns:am3d="http://schemas.microsoft.com/office/drawing/2017/model3d" xmlns:o="urn:schemas-microsoft-com:office:office" xmlns:oel="http://schemas.microsoft.com/office/2019/extlst" xmlns:r="http://schemas.openxmlformats.org/officeDocument/2006/relationships" xmlns:m="http://schemas.openxmlformats.org/officeDocument/2006/math" xmlns:v="urn:schemas-microsoft-com:vml" xmlns:wp14="http://schemas.microsoft.com/office/word/2010/wordprocessingDrawing" xmlns:wp="http://schemas.openxmlformats.org/drawingml/2006/wordprocessingDrawing" xmlns:w10="urn:schemas-microsoft-com:office:word" xmlns:w="http://schemas.openxmlformats.org/wordprocessingml/2006/main" xmlns:w14="http://schemas.microsoft.com/office/word/2010/wordml" xmlns:w15="http://schemas.microsoft.com/office/word/2012/wordml" xmlns:w16cei="http://schemas.microsoft.com/office/word/2026/wordml/cei" xmlns:w16cex="http://schemas.microsoft.com/office/word/2018/wordml/cex" xmlns:w16cid="http://schemas.microsoft.com/office/word/2016/wordml/cid" xmlns:w16="http://schemas.microsoft.com/office/word/2018/wordml" xmlns:w16du="http://schemas.microsoft.com/office/word/2023/wordml/word16du" xmlns:w16sdtdh="http://schemas.microsoft.com/office/word/2020/wordml/sdtdatahash" xmlns:w16sdtfl="http://schemas.microsoft.com/office/word/2024/wordml/sdtformatlock" xmlns:w16se="http://schemas.microsoft.com/office/word/2015/wordml/symex" xmlns:wpg="http://schemas.microsoft.com/office/word/2010/wordprocessingGroup" xmlns:wpi="http://schemas.microsoft.com/office/word/2010/wordprocessingInk" xmlns:wne="http://schemas.microsoft.com/office/word/2006/wordml" xmlns:wps="http://schemas.microsoft.com/office/word/2010/wordprocessingShape" mc:Ignorable="w14 w15 w16se w16cid w16 w16cex w16sdtdh w16sdtfl w16du wp14">
   <w:footnote w:type="separator" w:id="-1">
     <w:p>
       <w:r>
@@ -4236,7 +4314,7 @@
 </file>
 
 <file path=word/numbering.xml><?xml version="1.0" encoding="utf-8"?>
-<w:numbering xmlns:wpc="http://schemas.microsoft.com/office/word/2010/wordprocessingCanvas" xmlns:cx="http://schemas.microsoft.com/office/drawing/2014/chartex" xmlns:cx1="http://schemas.microsoft.com/office/drawing/2015/9/8/chartex" xmlns:cx2="http://schemas.microsoft.com/office/drawing/2015/10/21/chartex" xmlns:cx3="http://schemas.microsoft.com/office/drawing/2016/5/9/chartex" xmlns:cx4="http://schemas.microsoft.com/office/drawing/2016/5/10/chartex" xmlns:cx5="http://schemas.microsoft.com/office/drawing/2016/5/11/chartex" xmlns:cx6="http://schemas.microsoft.com/office/drawing/2016/5/12/chartex" xmlns:cx7="http://schemas.microsoft.com/office/drawing/2016/5/13/chartex" xmlns:cx8="http://schemas.microsoft.com/office/drawing/2016/5/14/chartex" xmlns:mc="http://schemas.openxmlformats.org/markup-compatibility/2006" xmlns:aink="http://schemas.microsoft.com/office/drawing/2016/ink" xmlns:am3d="http://schemas.microsoft.com/office/drawing/2017/model3d" xmlns:o="urn:schemas-microsoft-com:office:office" xmlns:oel="http://schemas.microsoft.com/office/2019/extlst" xmlns:r="http://schemas.openxmlformats.org/officeDocument/2006/relationships" xmlns:m="http://schemas.openxmlformats.org/officeDocument/2006/math" xmlns:v="urn:schemas-microsoft-com:vml" xmlns:wp14="http://schemas.microsoft.com/office/word/2010/wordprocessingDrawing" xmlns:wp="http://schemas.openxmlformats.org/drawingml/2006/wordprocessingDrawing" xmlns:w10="urn:schemas-microsoft-com:office:word" xmlns:w="http://schemas.openxmlformats.org/wordprocessingml/2006/main" xmlns:w14="http://schemas.microsoft.com/office/word/2010/wordml" xmlns:w15="http://schemas.microsoft.com/office/word/2012/wordml" xmlns:w16cex="http://schemas.microsoft.com/office/word/2018/wordml/cex" xmlns:w16cid="http://schemas.microsoft.com/office/word/2016/wordml/cid" xmlns:w16="http://schemas.microsoft.com/office/word/2018/wordml" xmlns:w16du="http://schemas.microsoft.com/office/word/2023/wordml/word16du" xmlns:w16sdtdh="http://schemas.microsoft.com/office/word/2020/wordml/sdtdatahash" xmlns:w16sdtfl="http://schemas.microsoft.com/office/word/2024/wordml/sdtformatlock" xmlns:w16se="http://schemas.microsoft.com/office/word/2015/wordml/symex" xmlns:wpg="http://schemas.microsoft.com/office/word/2010/wordprocessingGroup" xmlns:wpi="http://schemas.microsoft.com/office/word/2010/wordprocessingInk" xmlns:wne="http://schemas.microsoft.com/office/word/2006/wordml" xmlns:wps="http://schemas.microsoft.com/office/word/2010/wordprocessingShape" mc:Ignorable="w14 w15 w16se w16cid w16 w16cex w16sdtdh w16sdtfl w16du wp14">
+<w:numbering xmlns:wpc="http://schemas.microsoft.com/office/word/2010/wordprocessingCanvas" xmlns:cx="http://schemas.microsoft.com/office/drawing/2014/chartex" xmlns:cx1="http://schemas.microsoft.com/office/drawing/2015/9/8/chartex" xmlns:cx2="http://schemas.microsoft.com/office/drawing/2015/10/21/chartex" xmlns:cx3="http://schemas.microsoft.com/office/drawing/2016/5/9/chartex" xmlns:cx4="http://schemas.microsoft.com/office/drawing/2016/5/10/chartex" xmlns:cx5="http://schemas.microsoft.com/office/drawing/2016/5/11/chartex" xmlns:cx6="http://schemas.microsoft.com/office/drawing/2016/5/12/chartex" xmlns:cx7="http://schemas.microsoft.com/office/drawing/2016/5/13/chartex" xmlns:cx8="http://schemas.microsoft.com/office/drawing/2016/5/14/chartex" xmlns:mc="http://schemas.openxmlformats.org/markup-compatibility/2006" xmlns:aink="http://schemas.microsoft.com/office/drawing/2016/ink" xmlns:am3d="http://schemas.microsoft.com/office/drawing/2017/model3d" xmlns:o="urn:schemas-microsoft-com:office:office" xmlns:oel="http://schemas.microsoft.com/office/2019/extlst" xmlns:r="http://schemas.openxmlformats.org/officeDocument/2006/relationships" xmlns:m="http://schemas.openxmlformats.org/officeDocument/2006/math" xmlns:v="urn:schemas-microsoft-com:vml" xmlns:wp14="http://schemas.microsoft.com/office/word/2010/wordprocessingDrawing" xmlns:wp="http://schemas.openxmlformats.org/drawingml/2006/wordprocessingDrawing" xmlns:w10="urn:schemas-microsoft-com:office:word" xmlns:w="http://schemas.openxmlformats.org/wordprocessingml/2006/main" xmlns:w14="http://schemas.microsoft.com/office/word/2010/wordml" xmlns:w15="http://schemas.microsoft.com/office/word/2012/wordml" xmlns:w16cei="http://schemas.microsoft.com/office/word/2026/wordml/cei" xmlns:w16cex="http://schemas.microsoft.com/office/word/2018/wordml/cex" xmlns:w16cid="http://schemas.microsoft.com/office/word/2016/wordml/cid" xmlns:w16="http://schemas.microsoft.com/office/word/2018/wordml" xmlns:w16du="http://schemas.microsoft.com/office/word/2023/wordml/word16du" xmlns:w16sdtdh="http://schemas.microsoft.com/office/word/2020/wordml/sdtdatahash" xmlns:w16sdtfl="http://schemas.microsoft.com/office/word/2024/wordml/sdtformatlock" xmlns:w16se="http://schemas.microsoft.com/office/word/2015/wordml/symex" xmlns:wpg="http://schemas.microsoft.com/office/word/2010/wordprocessingGroup" xmlns:wpi="http://schemas.microsoft.com/office/word/2010/wordprocessingInk" xmlns:wne="http://schemas.microsoft.com/office/word/2006/wordml" xmlns:wps="http://schemas.microsoft.com/office/word/2010/wordprocessingShape" mc:Ignorable="w14 w15 w16se w16cid w16 w16cex w16sdtdh w16sdtfl w16du wp14">
   <w:abstractNum w:abstractNumId="0" w15:restartNumberingAfterBreak="0">
     <w:nsid w:val="05885CCC"/>
     <w:multiLevelType w:val="hybridMultilevel"/>
@@ -4803,7 +4881,6 @@
   <w:style w:type="character" w:default="1" w:styleId="DefaultParagraphFont">
     <w:name w:val="Default Paragraph Font"/>
     <w:uiPriority w:val="1"/>
-    <w:semiHidden/>
     <w:unhideWhenUsed/>
   </w:style>
   <w:style w:type="table" w:default="1" w:styleId="TableNormal">

</xml_diff>